<commit_message>
feat: add shadcn/ui components, update all admin pages and layouts, add BAB-2 doc
</commit_message>
<xml_diff>
--- a/.docs/BAB-1-PENDAHULUAN.docx
+++ b/.docs/BAB-1-PENDAHULUAN.docx
@@ -119,6 +119,8 @@
     </w:p>
     <w:p>
       <w:pPr>
+        <w:ind w:firstLine="720"/>
+        <w:jc w:val="both"/>
         <w:rPr>
           <w:color w:val="000000" w:themeColor="text1"/>
         </w:rPr>
@@ -139,13 +141,7 @@
         <w:rPr>
           <w:color w:val="000000" w:themeColor="text1"/>
         </w:rPr>
-        <w:t xml:space="preserve">(SPP) </w:t>
-      </w:r>
-      <w:r>
-        <w:rPr>
-          <w:color w:val="000000" w:themeColor="text1"/>
-        </w:rPr>
-        <w:t>ptdarrahman</w:t>
+        <w:t>(SPP) ptdarrahman</w:t>
       </w:r>
       <w:r>
         <w:t xml:space="preserve"> </w:t>
@@ -181,11 +177,11 @@
         <w:t>Backend</w:t>
       </w:r>
       <w:r>
-        <w:t xml:space="preserve"> dikembangkan menggunakan </w:t>
+        <w:t xml:space="preserve"> dikembangkan </w:t>
       </w:r>
       <w:r>
         <w:lastRenderedPageBreak/>
-        <w:t>FastAPI (</w:t>
+        <w:t>menggunakan FastAPI (</w:t>
       </w:r>
       <w:r>
         <w:rPr>
@@ -277,6 +273,9 @@
       </w:r>
     </w:p>
     <w:p>
+      <w:pPr>
+        <w:jc w:val="both"/>
+      </w:pPr>
       <w:r>
         <w:t>Berdasarkan latar belakang di atas, rumusan masalah dalam tugas akhir ini adalah:</w:t>
       </w:r>
@@ -284,6 +283,7 @@
     <w:p>
       <w:pPr>
         <w:pStyle w:val="ListNumber"/>
+        <w:jc w:val="both"/>
       </w:pPr>
       <w:r>
         <w:t xml:space="preserve">Bagaimana merancang ulang sistem pembayaran SPP </w:t>
@@ -298,6 +298,7 @@
     <w:p>
       <w:pPr>
         <w:pStyle w:val="ListNumber"/>
+        <w:jc w:val="both"/>
       </w:pPr>
       <w:r>
         <w:t>Bagaimana mengimplementasikan mekanisme pengelolaan tagihan dan pembayaran SPP yang mampu menghitung kewajiban pembayaran secara otomatis berdasarkan riwayat transaksi serta mendukung pembayaran secara online maupun manual?</w:t>
@@ -306,6 +307,7 @@
     <w:p>
       <w:pPr>
         <w:pStyle w:val="ListNumber"/>
+        <w:jc w:val="both"/>
         <w:rPr>
           <w:lang w:val="id-ID" w:eastAsia="zh-CN"/>
         </w:rPr>
@@ -326,6 +328,9 @@
       </w:r>
     </w:p>
     <w:p>
+      <w:pPr>
+        <w:jc w:val="both"/>
+      </w:pPr>
       <w:r>
         <w:t>Batasan masalah dalam tugas akhir ini adalah sebagai berikut:</w:t>
       </w:r>
@@ -337,6 +342,7 @@
           <w:ilvl w:val="0"/>
           <w:numId w:val="0"/>
         </w:numPr>
+        <w:jc w:val="both"/>
       </w:pPr>
       <w:r>
         <w:t>1. Sistem dirancang khusus untuk kebutuhan PTDARRAHMAN dan tidak bersifat umum untuk semua lembaga pendidikan.</w:t>
@@ -349,6 +355,7 @@
           <w:ilvl w:val="0"/>
           <w:numId w:val="0"/>
         </w:numPr>
+        <w:jc w:val="both"/>
       </w:pPr>
       <w:r>
         <w:t>2. Role pengguna terbatas pada Admin, Superadmin, Wali (orang tua/wali murid), dan Bendahara. Tidak terdapat role Murid yang login langsung ke sistem.</w:t>
@@ -361,6 +368,7 @@
           <w:ilvl w:val="0"/>
           <w:numId w:val="0"/>
         </w:numPr>
+        <w:jc w:val="both"/>
       </w:pPr>
       <w:r>
         <w:t>3. Pembayaran online menggunakan payment gateway simulator (Midtrans/Xendit/Simulator) dan tidak membahas implementasi teknis kerjasama dengan penyedia jasa pembayaran secara langsung.</w:t>
@@ -373,6 +381,7 @@
           <w:ilvl w:val="0"/>
           <w:numId w:val="0"/>
         </w:numPr>
+        <w:jc w:val="both"/>
       </w:pPr>
       <w:r>
         <w:t xml:space="preserve">7. </w:t>
@@ -399,6 +408,9 @@
       </w:r>
     </w:p>
     <w:p>
+      <w:pPr>
+        <w:jc w:val="both"/>
+      </w:pPr>
       <w:r>
         <w:t>Tujuan dari tugas akhir ini adalah:</w:t>
       </w:r>
@@ -408,11 +420,12 @@
         <w:pStyle w:val="ListNumber"/>
         <w:numPr>
           <w:ilvl w:val="0"/>
-          <w:numId w:val="0"/>
+          <w:numId w:val="14"/>
         </w:numPr>
+        <w:jc w:val="both"/>
       </w:pPr>
       <w:r>
-        <w:t>1. Menghasilkan sistem informasi pembayaran SPP berbasis web dengan arsitektur REST API (FastAPI) dan SPA (React 19) yang menggantikan sistem monolitik sebelumnya.</w:t>
+        <w:t>Menghasilkan sistem informasi pembayaran SPP berbasis web dengan arsitektur REST API (FastAPI) dan SPA (React 19) yang menggantikan sistem monolitik sebelumnya.</w:t>
       </w:r>
     </w:p>
     <w:p>
@@ -420,11 +433,12 @@
         <w:pStyle w:val="ListNumber"/>
         <w:numPr>
           <w:ilvl w:val="0"/>
-          <w:numId w:val="0"/>
+          <w:numId w:val="14"/>
         </w:numPr>
+        <w:jc w:val="both"/>
       </w:pPr>
       <w:r>
-        <w:t>2. Mengimplementasikan Virtual SPP Engine yang mampu menghitung status pembayaran SPP per bulan secara otomatis tanpa penyimpanan tagihan statis.</w:t>
+        <w:t>Mengimplementasikan Virtual SPP Engine yang mampu menghitung status pembayaran SPP per bulan secara otomatis tanpa penyimpanan tagihan statis.</w:t>
       </w:r>
     </w:p>
     <w:p>
@@ -432,11 +446,12 @@
         <w:pStyle w:val="ListNumber"/>
         <w:numPr>
           <w:ilvl w:val="0"/>
-          <w:numId w:val="0"/>
+          <w:numId w:val="14"/>
         </w:numPr>
+        <w:jc w:val="both"/>
       </w:pPr>
       <w:r>
-        <w:t>3. Mengintegrasikan payment gateway untuk pembayaran online serta menyediakan fitur pembayaran manual oleh admin.</w:t>
+        <w:t>Mengintegrasikan payment gateway untuk pembayaran online serta menyediakan fitur pembayaran manual oleh admin.</w:t>
       </w:r>
     </w:p>
     <w:p>
@@ -444,11 +459,12 @@
         <w:pStyle w:val="ListNumber"/>
         <w:numPr>
           <w:ilvl w:val="0"/>
-          <w:numId w:val="0"/>
+          <w:numId w:val="14"/>
         </w:numPr>
+        <w:jc w:val="both"/>
       </w:pPr>
       <w:r>
-        <w:t>4. Menyediakan portal wali murid yang memungkinkan pemantauan tagihan, pembayaran, dan unduh kuitansi secara mandiri.</w:t>
+        <w:t>Menyediakan portal wali murid yang memungkinkan pemantauan tagihan, pembayaran, dan unduh kuitansi secara mandiri.</w:t>
       </w:r>
     </w:p>
     <w:p>
@@ -456,11 +472,12 @@
         <w:pStyle w:val="ListNumber"/>
         <w:numPr>
           <w:ilvl w:val="0"/>
-          <w:numId w:val="0"/>
+          <w:numId w:val="14"/>
         </w:numPr>
+        <w:jc w:val="both"/>
       </w:pPr>
       <w:r>
-        <w:t>5. Mengimplementasikan fitur manajemen pengeluaran, pencatatan infaq, manajemen event/patungan, serta audit trail untuk mendukung tata kelola keuangan yang transparan.</w:t>
+        <w:t>Mengimplementasikan fitur manajemen pengeluaran, pencatatan infaq, manajemen event/patungan, serta audit trail untuk mendukung tata kelola keuangan yang transparan.</w:t>
       </w:r>
     </w:p>
     <w:p>
@@ -572,6 +589,7 @@
         <w:pStyle w:val="ListBullet"/>
       </w:pPr>
       <w:r>
+        <w:lastRenderedPageBreak/>
         <w:t>Mencatat pembayaran manual dengan cepat.</w:t>
       </w:r>
     </w:p>
@@ -588,7 +606,6 @@
         <w:pStyle w:val="ListBullet"/>
       </w:pPr>
       <w:r>
-        <w:lastRenderedPageBreak/>
         <w:t>Mengelola pengeluaran dan kas infaq secara digital.</w:t>
       </w:r>
     </w:p>
@@ -606,9 +623,652 @@
         <w:pStyle w:val="Heading3"/>
       </w:pPr>
       <w:r>
-        <w:t xml:space="preserve">1.4.2 </w:t>
+        <w:t>1.</w:t>
+      </w:r>
+      <w:r>
+        <w:t xml:space="preserve">5 </w:t>
+      </w:r>
+      <w:r>
+        <w:t>Sistematika Penulisan  (termasuk didalamnya ada timeline)</w:t>
       </w:r>
     </w:p>
+    <w:p>
+      <w:r>
+        <w:t>Sistematika penulisan dalam tugas akhir ini disusun untuk memberikan gambaran yang jelas mengenai alur penyusunan laporan. Penulisan laporan tugas akhir dibagi ke dalam lima bab, yaitu sebagai berikut:</w:t>
+      </w:r>
+    </w:p>
+    <w:p>
+      <w:pPr>
+        <w:ind w:left="720" w:hanging="720"/>
+      </w:pPr>
+      <w:r>
+        <w:t>1. BAB 1: Pendahuluan</w:t>
+      </w:r>
+    </w:p>
+    <w:p>
+      <w:pPr>
+        <w:ind w:left="720"/>
+      </w:pPr>
+      <w:r>
+        <w:t>Bab ini berisi latar belakang masalah, rumusan masalah, batasan masalah, tujuan dan manfaat penelitian, serta sistematika penulisan yang digunakan dalam penyusunan laporan tugas akhir.</w:t>
+      </w:r>
+    </w:p>
+    <w:p>
+      <w:pPr>
+        <w:ind w:left="720" w:hanging="720"/>
+      </w:pPr>
+      <w:r>
+        <w:t>2. BAB 2: Landasan Teori</w:t>
+      </w:r>
+    </w:p>
+    <w:p>
+      <w:pPr>
+        <w:ind w:left="720"/>
+      </w:pPr>
+      <w:r>
+        <w:t>Bab ini membahas teori-teori yang menjadi dasar dalam perancangan dan pengembangan sistem, meliputi konsep pembayaran SPP, arsitektur REST API, teknologi yang digunakan (FastAPI, React, PostgreSQL, dan lainnya), serta tinjauan terhadap penelitian atau sistem sejenis yang relevan.</w:t>
+      </w:r>
+    </w:p>
+    <w:p>
+      <w:pPr>
+        <w:ind w:left="720" w:hanging="720"/>
+      </w:pPr>
+      <w:r>
+        <w:t>3. BAB 3: Metode Penelitian</w:t>
+      </w:r>
+    </w:p>
+    <w:p>
+      <w:pPr>
+        <w:ind w:left="720"/>
+      </w:pPr>
+      <w:r>
+        <w:t>Bab ini menjelaskan metode pengembangan sistem yang digunakan, tahapan perancangan sistem mulai dari analisis kebutuhan, perancangan arsitektur, perancangan basis data, hingga perancangan antarmuka pengguna.</w:t>
+      </w:r>
+    </w:p>
+    <w:p>
+      <w:pPr>
+        <w:ind w:left="720" w:hanging="720"/>
+      </w:pPr>
+      <w:r>
+        <w:t>4. BAB 4: Hasil dan Pembahasan</w:t>
+      </w:r>
+    </w:p>
+    <w:p>
+      <w:pPr>
+        <w:ind w:left="720"/>
+      </w:pPr>
+      <w:r>
+        <w:t>Bab ini menyajikan hasil implementasi sistem yang telah dibangun beserta pembahasannya, termasuk hasil pengujian fungsionalitas setiap fitur, integrasi antara backend dan frontend, serta perbandingan antara sistem yang lama dengan sistem yang baru.</w:t>
+      </w:r>
+    </w:p>
+    <w:p>
+      <w:pPr>
+        <w:ind w:left="720" w:hanging="720"/>
+      </w:pPr>
+      <w:r>
+        <w:t>5. BAB 5: Penutup</w:t>
+      </w:r>
+    </w:p>
+    <w:p>
+      <w:pPr>
+        <w:ind w:left="720"/>
+      </w:pPr>
+      <w:r>
+        <w:t>Bab ini berisi kesimpulan dari keseluruhan pelaksanaan tugas akhir serta saran-saran yang bermanfaat untuk pengembangan sistem lebih lanjut di masa yang akan datang.</w:t>
+      </w:r>
+    </w:p>
+    <w:p/>
+    <w:p>
+      <w:r>
+        <w:t>Timeline Pelaksanaan</w:t>
+      </w:r>
+    </w:p>
+    <w:p>
+      <w:r>
+        <w:t>Rencana pelaksanaan pengembangan sistem tugas akhir disusun dalam enam tahap dengan estimasi durasi sebagai berikut:</w:t>
+      </w:r>
+    </w:p>
+    <w:tbl>
+      <w:tblPr>
+        <w:tblW w:w="0" w:type="auto"/>
+        <w:jc w:val="center"/>
+        <w:tblBorders>
+          <w:top w:val="single" w:sz="4" w:space="0" w:color="000000"/>
+          <w:left w:val="single" w:sz="4" w:space="0" w:color="000000"/>
+          <w:bottom w:val="single" w:sz="4" w:space="0" w:color="000000"/>
+          <w:right w:val="single" w:sz="4" w:space="0" w:color="000000"/>
+          <w:insideH w:val="single" w:sz="4" w:space="0" w:color="000000"/>
+          <w:insideV w:val="single" w:sz="4" w:space="0" w:color="000000"/>
+        </w:tblBorders>
+        <w:tblLook w:val="04A0" w:firstRow="1" w:lastRow="0" w:firstColumn="1" w:lastColumn="0" w:noHBand="0" w:noVBand="1"/>
+      </w:tblPr>
+      <w:tblGrid>
+        <w:gridCol w:w="685"/>
+        <w:gridCol w:w="3570"/>
+        <w:gridCol w:w="3387"/>
+        <w:gridCol w:w="1214"/>
+      </w:tblGrid>
+      <w:tr>
+        <w:trPr>
+          <w:jc w:val="center"/>
+        </w:trPr>
+        <w:tc>
+          <w:tcPr>
+            <w:tcW w:w="800" w:type="dxa"/>
+            <w:shd w:val="clear" w:color="auto" w:fill="D9E2F3"/>
+          </w:tcPr>
+          <w:p>
+            <w:pPr>
+              <w:jc w:val="center"/>
+            </w:pPr>
+            <w:r>
+              <w:rPr>
+                <w:b/>
+                <w:sz w:val="22"/>
+              </w:rPr>
+              <w:t>No</w:t>
+            </w:r>
+          </w:p>
+        </w:tc>
+        <w:tc>
+          <w:tcPr>
+            <w:tcW w:w="4800" w:type="dxa"/>
+            <w:shd w:val="clear" w:color="auto" w:fill="D9E2F3"/>
+          </w:tcPr>
+          <w:p>
+            <w:r>
+              <w:rPr>
+                <w:b/>
+                <w:sz w:val="22"/>
+              </w:rPr>
+              <w:t>Tahap / Fase Pekerjaan</w:t>
+            </w:r>
+          </w:p>
+        </w:tc>
+        <w:tc>
+          <w:tcPr>
+            <w:tcW w:w="4600" w:type="dxa"/>
+            <w:shd w:val="clear" w:color="auto" w:fill="D9E2F3"/>
+          </w:tcPr>
+          <w:p>
+            <w:pPr>
+              <w:jc w:val="center"/>
+            </w:pPr>
+            <w:r>
+              <w:rPr>
+                <w:b/>
+                <w:sz w:val="22"/>
+              </w:rPr>
+              <w:t>Output</w:t>
+            </w:r>
+          </w:p>
+        </w:tc>
+        <w:tc>
+          <w:tcPr>
+            <w:tcW w:w="1400" w:type="dxa"/>
+            <w:shd w:val="clear" w:color="auto" w:fill="D9E2F3"/>
+          </w:tcPr>
+          <w:p>
+            <w:pPr>
+              <w:jc w:val="center"/>
+            </w:pPr>
+            <w:r>
+              <w:rPr>
+                <w:b/>
+                <w:sz w:val="22"/>
+              </w:rPr>
+              <w:t>Durasi</w:t>
+            </w:r>
+          </w:p>
+        </w:tc>
+      </w:tr>
+      <w:tr>
+        <w:trPr>
+          <w:jc w:val="center"/>
+        </w:trPr>
+        <w:tc>
+          <w:tcPr>
+            <w:tcW w:w="800" w:type="dxa"/>
+          </w:tcPr>
+          <w:p>
+            <w:pPr>
+              <w:spacing w:before="60" w:after="60"/>
+              <w:jc w:val="center"/>
+            </w:pPr>
+            <w:r>
+              <w:rPr>
+                <w:sz w:val="22"/>
+              </w:rPr>
+              <w:t>1</w:t>
+            </w:r>
+          </w:p>
+        </w:tc>
+        <w:tc>
+          <w:tcPr>
+            <w:tcW w:w="4800" w:type="dxa"/>
+          </w:tcPr>
+          <w:p>
+            <w:pPr>
+              <w:spacing w:before="60" w:after="60"/>
+            </w:pPr>
+            <w:r>
+              <w:rPr>
+                <w:sz w:val="22"/>
+              </w:rPr>
+              <w:t>Studi Literatur &amp; Analisis Kebutuhan</w:t>
+            </w:r>
+          </w:p>
+        </w:tc>
+        <w:tc>
+          <w:tcPr>
+            <w:tcW w:w="4600" w:type="dxa"/>
+          </w:tcPr>
+          <w:p>
+            <w:pPr>
+              <w:spacing w:before="60" w:after="60"/>
+              <w:jc w:val="center"/>
+            </w:pPr>
+            <w:r>
+              <w:rPr>
+                <w:sz w:val="22"/>
+              </w:rPr>
+              <w:t>Dokumen analisis kebutuhan, PRD</w:t>
+            </w:r>
+          </w:p>
+        </w:tc>
+        <w:tc>
+          <w:tcPr>
+            <w:tcW w:w="1400" w:type="dxa"/>
+          </w:tcPr>
+          <w:p>
+            <w:pPr>
+              <w:spacing w:before="60" w:after="60"/>
+              <w:jc w:val="center"/>
+            </w:pPr>
+            <w:r>
+              <w:rPr>
+                <w:sz w:val="22"/>
+              </w:rPr>
+              <w:t>3 minggu</w:t>
+            </w:r>
+          </w:p>
+        </w:tc>
+      </w:tr>
+      <w:tr>
+        <w:trPr>
+          <w:jc w:val="center"/>
+        </w:trPr>
+        <w:tc>
+          <w:tcPr>
+            <w:tcW w:w="800" w:type="dxa"/>
+          </w:tcPr>
+          <w:p>
+            <w:pPr>
+              <w:spacing w:before="60" w:after="60"/>
+              <w:jc w:val="center"/>
+            </w:pPr>
+            <w:r>
+              <w:rPr>
+                <w:sz w:val="22"/>
+              </w:rPr>
+              <w:t>2</w:t>
+            </w:r>
+          </w:p>
+        </w:tc>
+        <w:tc>
+          <w:tcPr>
+            <w:tcW w:w="4800" w:type="dxa"/>
+          </w:tcPr>
+          <w:p>
+            <w:pPr>
+              <w:spacing w:before="60" w:after="60"/>
+            </w:pPr>
+            <w:r>
+              <w:rPr>
+                <w:sz w:val="22"/>
+              </w:rPr>
+              <w:t>Desain Sistem &amp; Basis Data</w:t>
+            </w:r>
+          </w:p>
+        </w:tc>
+        <w:tc>
+          <w:tcPr>
+            <w:tcW w:w="4600" w:type="dxa"/>
+          </w:tcPr>
+          <w:p>
+            <w:pPr>
+              <w:spacing w:before="60" w:after="60"/>
+              <w:jc w:val="center"/>
+            </w:pPr>
+            <w:r>
+              <w:rPr>
+                <w:sz w:val="22"/>
+              </w:rPr>
+              <w:t>Arsitektur sistem, ERD, skema database</w:t>
+            </w:r>
+          </w:p>
+        </w:tc>
+        <w:tc>
+          <w:tcPr>
+            <w:tcW w:w="1400" w:type="dxa"/>
+          </w:tcPr>
+          <w:p>
+            <w:pPr>
+              <w:spacing w:before="60" w:after="60"/>
+              <w:jc w:val="center"/>
+            </w:pPr>
+            <w:r>
+              <w:rPr>
+                <w:sz w:val="22"/>
+              </w:rPr>
+              <w:t>2</w:t>
+            </w:r>
+            <w:r>
+              <w:rPr>
+                <w:sz w:val="22"/>
+              </w:rPr>
+              <w:t xml:space="preserve"> minggu</w:t>
+            </w:r>
+          </w:p>
+        </w:tc>
+      </w:tr>
+      <w:tr>
+        <w:trPr>
+          <w:jc w:val="center"/>
+        </w:trPr>
+        <w:tc>
+          <w:tcPr>
+            <w:tcW w:w="800" w:type="dxa"/>
+          </w:tcPr>
+          <w:p>
+            <w:pPr>
+              <w:spacing w:before="60" w:after="60"/>
+              <w:jc w:val="center"/>
+            </w:pPr>
+            <w:r>
+              <w:rPr>
+                <w:sz w:val="22"/>
+              </w:rPr>
+              <w:t>3</w:t>
+            </w:r>
+          </w:p>
+        </w:tc>
+        <w:tc>
+          <w:tcPr>
+            <w:tcW w:w="4800" w:type="dxa"/>
+          </w:tcPr>
+          <w:p>
+            <w:pPr>
+              <w:spacing w:before="60" w:after="60"/>
+            </w:pPr>
+            <w:r>
+              <w:rPr>
+                <w:sz w:val="22"/>
+              </w:rPr>
+              <w:t>Implementasi Backend (FastAPI)</w:t>
+            </w:r>
+          </w:p>
+        </w:tc>
+        <w:tc>
+          <w:tcPr>
+            <w:tcW w:w="4600" w:type="dxa"/>
+          </w:tcPr>
+          <w:p>
+            <w:pPr>
+              <w:spacing w:before="60" w:after="60"/>
+              <w:jc w:val="center"/>
+            </w:pPr>
+            <w:r>
+              <w:rPr>
+                <w:sz w:val="22"/>
+              </w:rPr>
+              <w:t>REST API lengkap + migrasi database</w:t>
+            </w:r>
+          </w:p>
+        </w:tc>
+        <w:tc>
+          <w:tcPr>
+            <w:tcW w:w="1400" w:type="dxa"/>
+          </w:tcPr>
+          <w:p>
+            <w:pPr>
+              <w:spacing w:before="60" w:after="60"/>
+              <w:jc w:val="center"/>
+            </w:pPr>
+            <w:r>
+              <w:rPr>
+                <w:sz w:val="22"/>
+              </w:rPr>
+              <w:t>5 minggu</w:t>
+            </w:r>
+          </w:p>
+        </w:tc>
+      </w:tr>
+      <w:tr>
+        <w:trPr>
+          <w:jc w:val="center"/>
+        </w:trPr>
+        <w:tc>
+          <w:tcPr>
+            <w:tcW w:w="800" w:type="dxa"/>
+          </w:tcPr>
+          <w:p>
+            <w:pPr>
+              <w:spacing w:before="60" w:after="60"/>
+              <w:jc w:val="center"/>
+            </w:pPr>
+            <w:r>
+              <w:rPr>
+                <w:sz w:val="22"/>
+              </w:rPr>
+              <w:t>4</w:t>
+            </w:r>
+          </w:p>
+        </w:tc>
+        <w:tc>
+          <w:tcPr>
+            <w:tcW w:w="4800" w:type="dxa"/>
+          </w:tcPr>
+          <w:p>
+            <w:pPr>
+              <w:spacing w:before="60" w:after="60"/>
+            </w:pPr>
+            <w:r>
+              <w:rPr>
+                <w:sz w:val="22"/>
+              </w:rPr>
+              <w:t>Implementasi Frontend (React)</w:t>
+            </w:r>
+          </w:p>
+        </w:tc>
+        <w:tc>
+          <w:tcPr>
+            <w:tcW w:w="4600" w:type="dxa"/>
+          </w:tcPr>
+          <w:p>
+            <w:pPr>
+              <w:spacing w:before="60" w:after="60"/>
+              <w:jc w:val="center"/>
+            </w:pPr>
+            <w:r>
+              <w:rPr>
+                <w:sz w:val="22"/>
+              </w:rPr>
+              <w:t>Halaman admin &amp; wali murid</w:t>
+            </w:r>
+          </w:p>
+        </w:tc>
+        <w:tc>
+          <w:tcPr>
+            <w:tcW w:w="1400" w:type="dxa"/>
+          </w:tcPr>
+          <w:p>
+            <w:pPr>
+              <w:spacing w:before="60" w:after="60"/>
+              <w:jc w:val="center"/>
+            </w:pPr>
+            <w:r>
+              <w:rPr>
+                <w:sz w:val="22"/>
+              </w:rPr>
+              <w:t>5 minggu</w:t>
+            </w:r>
+          </w:p>
+        </w:tc>
+      </w:tr>
+      <w:tr>
+        <w:trPr>
+          <w:jc w:val="center"/>
+        </w:trPr>
+        <w:tc>
+          <w:tcPr>
+            <w:tcW w:w="800" w:type="dxa"/>
+          </w:tcPr>
+          <w:p>
+            <w:pPr>
+              <w:spacing w:before="60" w:after="60"/>
+              <w:jc w:val="center"/>
+            </w:pPr>
+            <w:r>
+              <w:rPr>
+                <w:sz w:val="22"/>
+              </w:rPr>
+              <w:t>5</w:t>
+            </w:r>
+          </w:p>
+        </w:tc>
+        <w:tc>
+          <w:tcPr>
+            <w:tcW w:w="4800" w:type="dxa"/>
+          </w:tcPr>
+          <w:p>
+            <w:pPr>
+              <w:spacing w:before="60" w:after="60"/>
+            </w:pPr>
+            <w:r>
+              <w:rPr>
+                <w:sz w:val="22"/>
+              </w:rPr>
+              <w:t>Integrasi &amp; Pengujian</w:t>
+            </w:r>
+          </w:p>
+        </w:tc>
+        <w:tc>
+          <w:tcPr>
+            <w:tcW w:w="4600" w:type="dxa"/>
+          </w:tcPr>
+          <w:p>
+            <w:pPr>
+              <w:spacing w:before="60" w:after="60"/>
+              <w:jc w:val="center"/>
+            </w:pPr>
+            <w:r>
+              <w:rPr>
+                <w:sz w:val="22"/>
+              </w:rPr>
+              <w:t>Sistem terintegrasi, hasil uji fungsional</w:t>
+            </w:r>
+          </w:p>
+        </w:tc>
+        <w:tc>
+          <w:tcPr>
+            <w:tcW w:w="1400" w:type="dxa"/>
+          </w:tcPr>
+          <w:p>
+            <w:pPr>
+              <w:spacing w:before="60" w:after="60"/>
+              <w:jc w:val="center"/>
+            </w:pPr>
+            <w:r>
+              <w:rPr>
+                <w:sz w:val="22"/>
+              </w:rPr>
+              <w:t>3 minggu</w:t>
+            </w:r>
+          </w:p>
+        </w:tc>
+      </w:tr>
+      <w:tr>
+        <w:trPr>
+          <w:jc w:val="center"/>
+        </w:trPr>
+        <w:tc>
+          <w:tcPr>
+            <w:tcW w:w="800" w:type="dxa"/>
+          </w:tcPr>
+          <w:p>
+            <w:pPr>
+              <w:spacing w:before="60" w:after="60"/>
+              <w:jc w:val="center"/>
+            </w:pPr>
+            <w:r>
+              <w:rPr>
+                <w:sz w:val="22"/>
+              </w:rPr>
+              <w:t>6</w:t>
+            </w:r>
+          </w:p>
+        </w:tc>
+        <w:tc>
+          <w:tcPr>
+            <w:tcW w:w="4800" w:type="dxa"/>
+          </w:tcPr>
+          <w:p>
+            <w:pPr>
+              <w:spacing w:before="60" w:after="60"/>
+            </w:pPr>
+            <w:r>
+              <w:rPr>
+                <w:sz w:val="22"/>
+              </w:rPr>
+              <w:t>Dokumentasi &amp; Penyusunan Laporan</w:t>
+            </w:r>
+          </w:p>
+        </w:tc>
+        <w:tc>
+          <w:tcPr>
+            <w:tcW w:w="4600" w:type="dxa"/>
+          </w:tcPr>
+          <w:p>
+            <w:pPr>
+              <w:spacing w:before="60" w:after="60"/>
+              <w:jc w:val="center"/>
+            </w:pPr>
+            <w:r>
+              <w:rPr>
+                <w:sz w:val="22"/>
+              </w:rPr>
+              <w:t>Laporan tugas akhir (BAB 1-5)</w:t>
+            </w:r>
+          </w:p>
+        </w:tc>
+        <w:tc>
+          <w:tcPr>
+            <w:tcW w:w="1400" w:type="dxa"/>
+          </w:tcPr>
+          <w:p>
+            <w:pPr>
+              <w:spacing w:before="60" w:after="60"/>
+              <w:jc w:val="center"/>
+            </w:pPr>
+            <w:r>
+              <w:rPr>
+                <w:sz w:val="22"/>
+              </w:rPr>
+              <w:t>2 minggu</w:t>
+            </w:r>
+          </w:p>
+        </w:tc>
+      </w:tr>
+    </w:tbl>
+    <w:p/>
+    <w:p>
+      <w:r>
+        <w:t>Jadwal di atas bersifat fleksibel dan dapat disesuaikan dengan kondisi serta kebutuhan perkuliahan dan bimbingan. Total estimasi pelaksanaan adalah sekitar 21 minggu (5 bulan).</w:t>
+      </w:r>
+    </w:p>
+    <w:p/>
+    <w:p/>
     <w:sectPr>
       <w:pgSz w:w="12240" w:h="15840"/>
       <w:pgMar w:top="1440" w:right="1800" w:bottom="1440" w:left="1800" w:header="720" w:footer="720" w:gutter="0"/>
@@ -793,6 +1453,181 @@
     </w:lvl>
   </w:abstractNum>
   <w:abstractNum w:abstractNumId="9" w15:restartNumberingAfterBreak="0">
+    <w:nsid w:val="13B8313D"/>
+    <w:multiLevelType w:val="hybridMultilevel"/>
+    <w:tmpl w:val="FD705BC6"/>
+    <w:lvl w:ilvl="0" w:tplc="0421000F">
+      <w:start w:val="1"/>
+      <w:numFmt w:val="decimal"/>
+      <w:lvlText w:val="%1."/>
+      <w:lvlJc w:val="left"/>
+      <w:pPr>
+        <w:ind w:left="720" w:hanging="360"/>
+      </w:pPr>
+      <w:rPr>
+        <w:rFonts w:hint="default"/>
+      </w:rPr>
+    </w:lvl>
+    <w:lvl w:ilvl="1" w:tplc="04210019" w:tentative="1">
+      <w:start w:val="1"/>
+      <w:numFmt w:val="lowerLetter"/>
+      <w:lvlText w:val="%2."/>
+      <w:lvlJc w:val="left"/>
+      <w:pPr>
+        <w:ind w:left="1440" w:hanging="360"/>
+      </w:pPr>
+    </w:lvl>
+    <w:lvl w:ilvl="2" w:tplc="0421001B" w:tentative="1">
+      <w:start w:val="1"/>
+      <w:numFmt w:val="lowerRoman"/>
+      <w:lvlText w:val="%3."/>
+      <w:lvlJc w:val="right"/>
+      <w:pPr>
+        <w:ind w:left="2160" w:hanging="180"/>
+      </w:pPr>
+    </w:lvl>
+    <w:lvl w:ilvl="3" w:tplc="0421000F" w:tentative="1">
+      <w:start w:val="1"/>
+      <w:numFmt w:val="decimal"/>
+      <w:lvlText w:val="%4."/>
+      <w:lvlJc w:val="left"/>
+      <w:pPr>
+        <w:ind w:left="2880" w:hanging="360"/>
+      </w:pPr>
+    </w:lvl>
+    <w:lvl w:ilvl="4" w:tplc="04210019" w:tentative="1">
+      <w:start w:val="1"/>
+      <w:numFmt w:val="lowerLetter"/>
+      <w:lvlText w:val="%5."/>
+      <w:lvlJc w:val="left"/>
+      <w:pPr>
+        <w:ind w:left="3600" w:hanging="360"/>
+      </w:pPr>
+    </w:lvl>
+    <w:lvl w:ilvl="5" w:tplc="0421001B" w:tentative="1">
+      <w:start w:val="1"/>
+      <w:numFmt w:val="lowerRoman"/>
+      <w:lvlText w:val="%6."/>
+      <w:lvlJc w:val="right"/>
+      <w:pPr>
+        <w:ind w:left="4320" w:hanging="180"/>
+      </w:pPr>
+    </w:lvl>
+    <w:lvl w:ilvl="6" w:tplc="0421000F" w:tentative="1">
+      <w:start w:val="1"/>
+      <w:numFmt w:val="decimal"/>
+      <w:lvlText w:val="%7."/>
+      <w:lvlJc w:val="left"/>
+      <w:pPr>
+        <w:ind w:left="5040" w:hanging="360"/>
+      </w:pPr>
+    </w:lvl>
+    <w:lvl w:ilvl="7" w:tplc="04210019" w:tentative="1">
+      <w:start w:val="1"/>
+      <w:numFmt w:val="lowerLetter"/>
+      <w:lvlText w:val="%8."/>
+      <w:lvlJc w:val="left"/>
+      <w:pPr>
+        <w:ind w:left="5760" w:hanging="360"/>
+      </w:pPr>
+    </w:lvl>
+    <w:lvl w:ilvl="8" w:tplc="0421001B" w:tentative="1">
+      <w:start w:val="1"/>
+      <w:numFmt w:val="lowerRoman"/>
+      <w:lvlText w:val="%9."/>
+      <w:lvlJc w:val="right"/>
+      <w:pPr>
+        <w:ind w:left="6480" w:hanging="180"/>
+      </w:pPr>
+    </w:lvl>
+  </w:abstractNum>
+  <w:abstractNum w:abstractNumId="10" w15:restartNumberingAfterBreak="0">
+    <w:nsid w:val="4EEB47EE"/>
+    <w:multiLevelType w:val="hybridMultilevel"/>
+    <w:tmpl w:val="8CBA2FF2"/>
+    <w:lvl w:ilvl="0" w:tplc="0421000F">
+      <w:start w:val="1"/>
+      <w:numFmt w:val="decimal"/>
+      <w:lvlText w:val="%1."/>
+      <w:lvlJc w:val="left"/>
+      <w:pPr>
+        <w:ind w:left="720" w:hanging="360"/>
+      </w:pPr>
+    </w:lvl>
+    <w:lvl w:ilvl="1" w:tplc="04210019" w:tentative="1">
+      <w:start w:val="1"/>
+      <w:numFmt w:val="lowerLetter"/>
+      <w:lvlText w:val="%2."/>
+      <w:lvlJc w:val="left"/>
+      <w:pPr>
+        <w:ind w:left="1440" w:hanging="360"/>
+      </w:pPr>
+    </w:lvl>
+    <w:lvl w:ilvl="2" w:tplc="0421001B" w:tentative="1">
+      <w:start w:val="1"/>
+      <w:numFmt w:val="lowerRoman"/>
+      <w:lvlText w:val="%3."/>
+      <w:lvlJc w:val="right"/>
+      <w:pPr>
+        <w:ind w:left="2160" w:hanging="180"/>
+      </w:pPr>
+    </w:lvl>
+    <w:lvl w:ilvl="3" w:tplc="0421000F" w:tentative="1">
+      <w:start w:val="1"/>
+      <w:numFmt w:val="decimal"/>
+      <w:lvlText w:val="%4."/>
+      <w:lvlJc w:val="left"/>
+      <w:pPr>
+        <w:ind w:left="2880" w:hanging="360"/>
+      </w:pPr>
+    </w:lvl>
+    <w:lvl w:ilvl="4" w:tplc="04210019" w:tentative="1">
+      <w:start w:val="1"/>
+      <w:numFmt w:val="lowerLetter"/>
+      <w:lvlText w:val="%5."/>
+      <w:lvlJc w:val="left"/>
+      <w:pPr>
+        <w:ind w:left="3600" w:hanging="360"/>
+      </w:pPr>
+    </w:lvl>
+    <w:lvl w:ilvl="5" w:tplc="0421001B" w:tentative="1">
+      <w:start w:val="1"/>
+      <w:numFmt w:val="lowerRoman"/>
+      <w:lvlText w:val="%6."/>
+      <w:lvlJc w:val="right"/>
+      <w:pPr>
+        <w:ind w:left="4320" w:hanging="180"/>
+      </w:pPr>
+    </w:lvl>
+    <w:lvl w:ilvl="6" w:tplc="0421000F" w:tentative="1">
+      <w:start w:val="1"/>
+      <w:numFmt w:val="decimal"/>
+      <w:lvlText w:val="%7."/>
+      <w:lvlJc w:val="left"/>
+      <w:pPr>
+        <w:ind w:left="5040" w:hanging="360"/>
+      </w:pPr>
+    </w:lvl>
+    <w:lvl w:ilvl="7" w:tplc="04210019" w:tentative="1">
+      <w:start w:val="1"/>
+      <w:numFmt w:val="lowerLetter"/>
+      <w:lvlText w:val="%8."/>
+      <w:lvlJc w:val="left"/>
+      <w:pPr>
+        <w:ind w:left="5760" w:hanging="360"/>
+      </w:pPr>
+    </w:lvl>
+    <w:lvl w:ilvl="8" w:tplc="0421001B" w:tentative="1">
+      <w:start w:val="1"/>
+      <w:numFmt w:val="lowerRoman"/>
+      <w:lvlText w:val="%9."/>
+      <w:lvlJc w:val="right"/>
+      <w:pPr>
+        <w:ind w:left="6480" w:hanging="180"/>
+      </w:pPr>
+    </w:lvl>
+  </w:abstractNum>
+  <w:abstractNum w:abstractNumId="11" w15:restartNumberingAfterBreak="0">
     <w:nsid w:val="6341089B"/>
     <w:multiLevelType w:val="multilevel"/>
     <w:tmpl w:val="C2CEF150"/>
@@ -939,6 +1774,12 @@
     <w:abstractNumId w:val="7"/>
   </w:num>
   <w:num w:numId="12" w16cid:durableId="681468747">
+    <w:abstractNumId w:val="11"/>
+  </w:num>
+  <w:num w:numId="13" w16cid:durableId="1933539911">
+    <w:abstractNumId w:val="10"/>
+  </w:num>
+  <w:num w:numId="14" w16cid:durableId="1406028968">
     <w:abstractNumId w:val="9"/>
   </w:num>
 </w:numbering>
@@ -1554,6 +2395,7 @@
   <w:style w:type="character" w:default="1" w:styleId="DefaultParagraphFont">
     <w:name w:val="Default Paragraph Font"/>
     <w:uiPriority w:val="1"/>
+    <w:semiHidden/>
     <w:unhideWhenUsed/>
   </w:style>
   <w:style w:type="table" w:default="1" w:styleId="TableNormal">

</xml_diff>